<commit_message>
24/9 Mail Template Update + Timeout session +
</commit_message>
<xml_diff>
--- a/docs/user-guides/manuals/user-manual-executive.th.docx
+++ b/docs/user-guides/manuals/user-manual-executive.th.docx
@@ -181,7 +181,7 @@
           <w:sz w:val="28"/>
           <w:szCs w:val="28"/>
         </w:rPr>
-        <w:t xml:space="preserve">เวอร์ชันระบบ v1.7.1</w:t>
+        <w:t xml:space="preserve">เวอร์ชันระบบ v1.7.6</w:t>
       </w:r>
       <w:r>
         <w:rPr>
@@ -197,7 +197,7 @@
           <w:sz w:val="28"/>
           <w:szCs w:val="28"/>
         </w:rPr>
-        <w:t xml:space="preserve">ปรับปรุงล่าสุด 18 กันยายน 2026</w:t>
+        <w:t xml:space="preserve">ปรับปรุงล่าสุด 24 กันยายน 2026</w:t>
       </w:r>
     </w:p>
     <w:p>
@@ -211,7 +211,7 @@
           <w:sz w:val="28"/>
           <w:szCs w:val="28"/>
         </w:rPr>
-        <w:t xml:space="preserve">คู่มือฉบับที่ 1.3</w:t>
+        <w:t xml:space="preserve">คู่มือฉบับที่ 1.4</w:t>
       </w:r>
     </w:p>
     <w:p>

</xml_diff>

<commit_message>
30/9 Dashboard + Manual Improvement
</commit_message>
<xml_diff>
--- a/docs/user-guides/manuals/user-manual-executive.th.docx
+++ b/docs/user-guides/manuals/user-manual-executive.th.docx
@@ -211,7 +211,7 @@
           <w:sz w:val="28"/>
           <w:szCs w:val="28"/>
         </w:rPr>
-        <w:t xml:space="preserve">คู่มือฉบับที่ 1.5</w:t>
+        <w:t xml:space="preserve">คู่มือฉบับที่ 1.6</w:t>
       </w:r>
     </w:p>
     <w:p>
@@ -468,7 +468,7 @@
           <w:sz w:val="32"/>
           <w:szCs w:val="32"/>
         </w:rPr>
-        <w:t xml:space="preserve">บทบาทผู้บริหารเป็นการดูภาพรวมแบบอ่านอย่างเดียวผ่านแดชบอร์ดสรุป คุณจะเห็นตัวชี้วัดสำคัญ แนวโน้ม และสถานะความเสี่ยง โดยไม่เห็นรายการตั๋วงานรายเคส</w:t>
+        <w:t xml:space="preserve">บทบาทผู้บริหารเป็นการดูภาพรวมแบบอ่านอย่างเดียวผ่านแดชบอร์ด คุณจะเห็นตัวชี้วัดสำคัญ แนวโน้ม และสถานะความเสี่ยง โดยเปิดหน้ารายละเอียดของตั๋วงานรายเคสไม่ได้</w:t>
       </w:r>
     </w:p>
     <w:tbl>
@@ -724,6 +724,57 @@
         <w:t xml:space="preserve"> แล้วกดเข้าสู่ระบบ</w:t>
       </w:r>
     </w:p>
+    <w:p>
+      <w:pPr>
+        <w:pStyle w:val="ListParagraph"/>
+        <w:numPr>
+          <w:ilvl w:val="0"/>
+          <w:numId w:val="2"/>
+        </w:numPr>
+        <w:spacing w:after="80"/>
+      </w:pPr>
+      <w:r>
+        <w:rPr>
+          <w:sz w:val="32"/>
+          <w:szCs w:val="32"/>
+        </w:rPr>
+        <w:t xml:space="preserve">ระบบพาคุณไปที่ </w:t>
+      </w:r>
+      <w:r>
+        <w:rPr>
+          <w:b/>
+          <w:bCs/>
+          <w:color w:val="245EA8"/>
+          <w:sz w:val="32"/>
+          <w:szCs w:val="32"/>
+        </w:rPr>
+        <w:t xml:space="preserve">แดชบอร์ด SOC</w:t>
+      </w:r>
+      <w:r>
+        <w:rPr>
+          <w:sz w:val="32"/>
+          <w:szCs w:val="32"/>
+        </w:rPr>
+        <w:t xml:space="preserve"> ก่อนเสมอ — กดเมนู </w:t>
+      </w:r>
+      <w:r>
+        <w:rPr>
+          <w:b/>
+          <w:bCs/>
+          <w:color w:val="245EA8"/>
+          <w:sz w:val="32"/>
+          <w:szCs w:val="32"/>
+        </w:rPr>
+        <w:t xml:space="preserve">ภาพรวม › แดชบอร์ดผู้บริหาร</w:t>
+      </w:r>
+      <w:r>
+        <w:rPr>
+          <w:sz w:val="32"/>
+          <w:szCs w:val="32"/>
+        </w:rPr>
+        <w:t xml:space="preserve"> เพื่อเปิดหน้าสรุปสำหรับผู้บริหาร (ดูหัวข้อ 4)</w:t>
+      </w:r>
+    </w:p>
     <w:tbl>
       <w:tblPr>
         <w:tblW w:type="dxa" w:w="9600"/>
@@ -842,7 +893,7 @@
           <w:sz w:val="32"/>
           <w:szCs w:val="32"/>
         </w:rPr>
-        <w:t xml:space="preserve">เมนู </w:t>
+        <w:t xml:space="preserve">แถบเมนูของคุณมีสองรายการ ทั้งคู่อยู่ในกลุ่ม </w:t>
       </w:r>
       <w:r>
         <w:rPr>
@@ -852,19 +903,236 @@
           <w:sz w:val="32"/>
           <w:szCs w:val="32"/>
         </w:rPr>
-        <w:t xml:space="preserve">ภาพรวม › แดชบอร์ดผู้บริหาร</w:t>
-      </w:r>
-      <w:r>
-        <w:rPr>
-          <w:sz w:val="32"/>
-          <w:szCs w:val="32"/>
-        </w:rPr>
-        <w:t xml:space="preserve"> คือหน้าจอหลักและหน้าจอเดียวของคุณ พาดหัวหน้าจอว่า </w:t>
+        <w:t xml:space="preserve">ภาพรวม</w:t>
+      </w:r>
+      <w:r>
+        <w:rPr>
+          <w:sz w:val="32"/>
+          <w:szCs w:val="32"/>
+        </w:rPr>
+        <w:t xml:space="preserve">:</w:t>
+      </w:r>
+    </w:p>
+    <w:tbl>
+      <w:tblPr>
+        <w:tblW w:type="dxa" w:w="9600"/>
+        <w:tblBorders>
+          <w:top w:val="single" w:color="E1E6ED" w:sz="2"/>
+          <w:left w:val="single" w:color="E1E6ED" w:sz="2"/>
+          <w:bottom w:val="single" w:color="E1E6ED" w:sz="2"/>
+          <w:right w:val="single" w:color="E1E6ED" w:sz="2"/>
+          <w:insideH w:val="single" w:color="E1E6ED" w:sz="2"/>
+          <w:insideV w:val="single" w:color="E1E6ED" w:sz="2"/>
+        </w:tblBorders>
+      </w:tblPr>
+      <w:tblGrid>
+        <w:gridCol w:w="3400"/>
+        <w:gridCol w:w="6200"/>
+      </w:tblGrid>
+      <w:tr>
+        <w:trPr>
+          <w:cantSplit/>
+          <w:tblHeader/>
+        </w:trPr>
+        <w:tc>
+          <w:tcPr>
+            <w:tcW w:type="dxa" w:w="3400"/>
+            <w:shd w:fill="1A1A2E" w:color="auto" w:val="clear"/>
+            <w:tcMar>
+              <w:top w:type="dxa" w:w="80"/>
+              <w:left w:type="dxa" w:w="120"/>
+              <w:bottom w:type="dxa" w:w="80"/>
+              <w:right w:type="dxa" w:w="120"/>
+            </w:tcMar>
+          </w:tcPr>
+          <w:p>
+            <w:r>
+              <w:rPr>
+                <w:b/>
+                <w:bCs/>
+                <w:color w:val="FFFFFF"/>
+                <w:sz w:val="28"/>
+                <w:szCs w:val="28"/>
+              </w:rPr>
+              <w:t xml:space="preserve">เมนู</w:t>
+            </w:r>
+          </w:p>
+        </w:tc>
+        <w:tc>
+          <w:tcPr>
+            <w:tcW w:type="dxa" w:w="6200"/>
+            <w:shd w:fill="1A1A2E" w:color="auto" w:val="clear"/>
+            <w:tcMar>
+              <w:top w:type="dxa" w:w="80"/>
+              <w:left w:type="dxa" w:w="120"/>
+              <w:bottom w:type="dxa" w:w="80"/>
+              <w:right w:type="dxa" w:w="120"/>
+            </w:tcMar>
+          </w:tcPr>
+          <w:p>
+            <w:r>
+              <w:rPr>
+                <w:b/>
+                <w:bCs/>
+                <w:color w:val="FFFFFF"/>
+                <w:sz w:val="28"/>
+                <w:szCs w:val="28"/>
+              </w:rPr>
+              <w:t xml:space="preserve">หน้าที่</w:t>
+            </w:r>
+          </w:p>
+        </w:tc>
+      </w:tr>
+      <w:tr>
+        <w:trPr>
+          <w:cantSplit/>
+        </w:trPr>
+        <w:tc>
+          <w:tcPr>
+            <w:tcW w:type="dxa" w:w="3400"/>
+            <w:shd w:fill="FFFFFF" w:color="auto" w:val="clear"/>
+            <w:tcMar>
+              <w:top w:type="dxa" w:w="70"/>
+              <w:left w:type="dxa" w:w="120"/>
+              <w:bottom w:type="dxa" w:w="70"/>
+              <w:right w:type="dxa" w:w="120"/>
+            </w:tcMar>
+          </w:tcPr>
+          <w:p>
+            <w:pPr>
+              <w:spacing w:after="0"/>
+            </w:pPr>
+            <w:r>
+              <w:rPr>
+                <w:b/>
+                <w:bCs/>
+                <w:color w:val="245EA8"/>
+                <w:sz w:val="32"/>
+                <w:szCs w:val="32"/>
+              </w:rPr>
+              <w:t xml:space="preserve">แดชบอร์ด SOC</w:t>
+            </w:r>
+          </w:p>
+        </w:tc>
+        <w:tc>
+          <w:tcPr>
+            <w:tcW w:type="dxa" w:w="6200"/>
+            <w:shd w:fill="FFFFFF" w:color="auto" w:val="clear"/>
+            <w:tcMar>
+              <w:top w:type="dxa" w:w="70"/>
+              <w:left w:type="dxa" w:w="120"/>
+              <w:bottom w:type="dxa" w:w="70"/>
+              <w:right w:type="dxa" w:w="120"/>
+            </w:tcMar>
+          </w:tcPr>
+          <w:p>
+            <w:pPr>
+              <w:spacing w:after="0"/>
+            </w:pPr>
+            <w:r>
+              <w:rPr>
+                <w:sz w:val="28"/>
+                <w:szCs w:val="28"/>
+              </w:rPr>
+              <w:t xml:space="preserve">ภาพรวมการปฏิบัติงานของทีม SOC (ภาระงาน คิว และเคสที่เปิดอยู่) — เป็นหน้าแรกหลังเข้าสู่ระบบ แต่ออกแบบมาสำหรับงานประจำวันของผู้จัดการ SOC</w:t>
+            </w:r>
+          </w:p>
+        </w:tc>
+      </w:tr>
+      <w:tr>
+        <w:trPr>
+          <w:cantSplit/>
+        </w:trPr>
+        <w:tc>
+          <w:tcPr>
+            <w:tcW w:type="dxa" w:w="3400"/>
+            <w:shd w:fill="F7F8FA" w:color="auto" w:val="clear"/>
+            <w:tcMar>
+              <w:top w:type="dxa" w:w="70"/>
+              <w:left w:type="dxa" w:w="120"/>
+              <w:bottom w:type="dxa" w:w="70"/>
+              <w:right w:type="dxa" w:w="120"/>
+            </w:tcMar>
+          </w:tcPr>
+          <w:p>
+            <w:pPr>
+              <w:spacing w:after="0"/>
+            </w:pPr>
+            <w:r>
+              <w:rPr>
+                <w:b/>
+                <w:bCs/>
+                <w:color w:val="245EA8"/>
+                <w:sz w:val="32"/>
+                <w:szCs w:val="32"/>
+              </w:rPr>
+              <w:t xml:space="preserve">แดชบอร์ดผู้บริหาร</w:t>
+            </w:r>
+          </w:p>
+        </w:tc>
+        <w:tc>
+          <w:tcPr>
+            <w:tcW w:type="dxa" w:w="6200"/>
+            <w:shd w:fill="F7F8FA" w:color="auto" w:val="clear"/>
+            <w:tcMar>
+              <w:top w:type="dxa" w:w="70"/>
+              <w:left w:type="dxa" w:w="120"/>
+              <w:bottom w:type="dxa" w:w="70"/>
+              <w:right w:type="dxa" w:w="120"/>
+            </w:tcMar>
+          </w:tcPr>
+          <w:p>
+            <w:pPr>
+              <w:spacing w:after="0"/>
+            </w:pPr>
+            <w:r>
+              <w:rPr>
+                <w:sz w:val="28"/>
+                <w:szCs w:val="28"/>
+              </w:rPr>
+              <w:t xml:space="preserve">หน้าสรุปความเสี่ยงสำหรับผู้บริหาร — หน้าหลักที่คู่มือเล่มนี้อธิบาย</w:t>
+            </w:r>
+          </w:p>
+        </w:tc>
+      </w:tr>
+    </w:tbl>
+    <w:p>
+      <w:pPr>
+        <w:spacing w:after="140"/>
+      </w:pPr>
+    </w:p>
+    <w:p>
+      <w:pPr>
+        <w:spacing w:after="120"/>
+      </w:pPr>
+      <w:r>
+        <w:rPr>
+          <w:sz w:val="32"/>
+          <w:szCs w:val="32"/>
+        </w:rPr>
+        <w:t xml:space="preserve">เมนู </w:t>
       </w:r>
       <w:r>
         <w:rPr>
           <w:b/>
           <w:bCs/>
+          <w:color w:val="245EA8"/>
+          <w:sz w:val="32"/>
+          <w:szCs w:val="32"/>
+        </w:rPr>
+        <w:t xml:space="preserve">ภาพรวม › แดชบอร์ดผู้บริหาร</w:t>
+      </w:r>
+      <w:r>
+        <w:rPr>
+          <w:sz w:val="32"/>
+          <w:szCs w:val="32"/>
+        </w:rPr>
+        <w:t xml:space="preserve"> คือหน้าจอหลักของคุณ พาดหัวหน้าจอว่า </w:t>
+      </w:r>
+      <w:r>
+        <w:rPr>
+          <w:b/>
+          <w:bCs/>
           <w:sz w:val="32"/>
           <w:szCs w:val="32"/>
         </w:rPr>
@@ -875,7 +1143,7 @@
           <w:sz w:val="32"/>
           <w:szCs w:val="32"/>
         </w:rPr>
-        <w:t xml:space="preserve"> แบ่งเป็นส่วนสรุปสถานการณ์ ตัวชี้วัด ความคืบหน้าการปิดงาน กราฟสถานะ และตารางรายละเอียด</w:t>
+        <w:t xml:space="preserve"> แบ่งเป็นส่วนสรุปสถานการณ์ ตัวชี้วัด ความคืบหน้าการปิดงาน กราฟสถานะ ความคืบหน้าทีมตอบสนองเหตุการณ์ และตารางรายละเอียด</w:t>
       </w:r>
     </w:p>
     <w:p>
@@ -897,14 +1165,48 @@
           <w:sz w:val="32"/>
           <w:szCs w:val="32"/>
         </w:rPr>
-        <w:t xml:space="preserve">ข้อมูล ณ เวลา</w:t>
-      </w:r>
-      <w:r>
-        <w:rPr>
-          <w:sz w:val="32"/>
-          <w:szCs w:val="32"/>
-        </w:rPr>
-        <w:t xml:space="preserve"> เสมอ ใช้ยืนยันว่าตัวเลขที่คุณกำลังดูสดแค่ไหน ก่อนนำไปอ้างอิงในที่ประชุม</w:t>
+        <w:t xml:space="preserve">หน้าแดชบอร์ดอัปเดต</w:t>
+      </w:r>
+      <w:r>
+        <w:rPr>
+          <w:sz w:val="32"/>
+          <w:szCs w:val="32"/>
+        </w:rPr>
+        <w:t xml:space="preserve"> (เวลาที่เปิดหน้านี้) เสมอ ใช้ยืนยันว่าตัวเลขที่คุณกำลังดูสดแค่ไหน ก่อนนำไปอ้างอิงในที่ประชุม ใต้บรรทัดนั้นมี </w:t>
+      </w:r>
+      <w:r>
+        <w:rPr>
+          <w:b/>
+          <w:bCs/>
+          <w:color w:val="1F2D3D"/>
+          <w:sz w:val="32"/>
+          <w:szCs w:val="32"/>
+        </w:rPr>
+        <w:t xml:space="preserve">Wazuh poll สำเร็จล่าสุด</w:t>
+      </w:r>
+      <w:r>
+        <w:rPr>
+          <w:sz w:val="32"/>
+          <w:szCs w:val="32"/>
+        </w:rPr>
+        <w:t xml:space="preserve"> และ </w:t>
+      </w:r>
+      <w:r>
+        <w:rPr>
+          <w:b/>
+          <w:bCs/>
+          <w:color w:val="1F2D3D"/>
+          <w:sz w:val="32"/>
+          <w:szCs w:val="32"/>
+        </w:rPr>
+        <w:t xml:space="preserve">เหตุการณ์ Wazuh ล่าสุด</w:t>
+      </w:r>
+      <w:r>
+        <w:rPr>
+          <w:sz w:val="32"/>
+          <w:szCs w:val="32"/>
+        </w:rPr>
+        <w:t xml:space="preserve"> บอกว่าระบบรับการแจ้งเตือนจาก Wazuh ล่าสุดเมื่อใด — หากนานผิดปกติ ตัวเลขอาจยังไม่รวมเหตุการณ์ล่าสุด ให้แจ้งผู้จัดการ SOC</w:t>
       </w:r>
     </w:p>
     <w:tbl>
@@ -1045,7 +1347,7 @@
           <w:sz w:val="32"/>
           <w:szCs w:val="32"/>
         </w:rPr>
-        <w:t xml:space="preserve">ทุกตัวเลขบนหน้านี้ขึ้นกับช่วงเวลาที่เลือก เลือกได้ </w:t>
+        <w:t xml:space="preserve">เลือกช่วงเวลาได้ </w:t>
       </w:r>
       <w:r>
         <w:rPr>
@@ -1164,7 +1466,7 @@
           <w:sz w:val="32"/>
           <w:szCs w:val="32"/>
         </w:rPr>
-        <w:t xml:space="preserve"> คืนค่ากลับเป็นค่าเริ่มต้น</w:t>
+        <w:t xml:space="preserve"> คืนค่ากลับเป็นค่าเริ่มต้น ช่วงเวลานับจากวันที่เปิดเคส</w:t>
       </w:r>
     </w:p>
     <w:tbl>
@@ -1268,6 +1570,372 @@
         <w:t xml:space="preserve">แถบตัวกรองช่วงเวลาบนแดชบอร์ดผู้บริหาร</w:t>
       </w:r>
     </w:p>
+    <w:p>
+      <w:pPr>
+        <w:spacing w:after="120"/>
+      </w:pPr>
+      <w:r>
+        <w:rPr>
+          <w:sz w:val="32"/>
+          <w:szCs w:val="32"/>
+        </w:rPr>
+        <w:t xml:space="preserve">ตัวกรองนี้ไม่ได้มีผลกับทุกส่วนของหน้า — ดูป้ายสีเทาท้ายหัวข้อของแต่ละส่วน ซึ่งบอกช่วงเวลาที่ส่วนนั้นใช้:</w:t>
+      </w:r>
+    </w:p>
+    <w:tbl>
+      <w:tblPr>
+        <w:tblW w:type="dxa" w:w="9600"/>
+        <w:tblBorders>
+          <w:top w:val="single" w:color="E1E6ED" w:sz="2"/>
+          <w:left w:val="single" w:color="E1E6ED" w:sz="2"/>
+          <w:bottom w:val="single" w:color="E1E6ED" w:sz="2"/>
+          <w:right w:val="single" w:color="E1E6ED" w:sz="2"/>
+          <w:insideH w:val="single" w:color="E1E6ED" w:sz="2"/>
+          <w:insideV w:val="single" w:color="E1E6ED" w:sz="2"/>
+        </w:tblBorders>
+      </w:tblPr>
+      <w:tblGrid>
+        <w:gridCol w:w="4600"/>
+        <w:gridCol w:w="5000"/>
+      </w:tblGrid>
+      <w:tr>
+        <w:trPr>
+          <w:cantSplit/>
+          <w:tblHeader/>
+        </w:trPr>
+        <w:tc>
+          <w:tcPr>
+            <w:tcW w:type="dxa" w:w="4600"/>
+            <w:shd w:fill="1A1A2E" w:color="auto" w:val="clear"/>
+            <w:tcMar>
+              <w:top w:type="dxa" w:w="80"/>
+              <w:left w:type="dxa" w:w="120"/>
+              <w:bottom w:type="dxa" w:w="80"/>
+              <w:right w:type="dxa" w:w="120"/>
+            </w:tcMar>
+          </w:tcPr>
+          <w:p>
+            <w:r>
+              <w:rPr>
+                <w:b/>
+                <w:bCs/>
+                <w:color w:val="FFFFFF"/>
+                <w:sz w:val="28"/>
+                <w:szCs w:val="28"/>
+              </w:rPr>
+              <w:t xml:space="preserve">ส่วน</w:t>
+            </w:r>
+          </w:p>
+        </w:tc>
+        <w:tc>
+          <w:tcPr>
+            <w:tcW w:type="dxa" w:w="5000"/>
+            <w:shd w:fill="1A1A2E" w:color="auto" w:val="clear"/>
+            <w:tcMar>
+              <w:top w:type="dxa" w:w="80"/>
+              <w:left w:type="dxa" w:w="120"/>
+              <w:bottom w:type="dxa" w:w="80"/>
+              <w:right w:type="dxa" w:w="120"/>
+            </w:tcMar>
+          </w:tcPr>
+          <w:p>
+            <w:r>
+              <w:rPr>
+                <w:b/>
+                <w:bCs/>
+                <w:color w:val="FFFFFF"/>
+                <w:sz w:val="28"/>
+                <w:szCs w:val="28"/>
+              </w:rPr>
+              <w:t xml:space="preserve">ใช้ช่วงเวลาใด</w:t>
+            </w:r>
+          </w:p>
+        </w:tc>
+      </w:tr>
+      <w:tr>
+        <w:trPr>
+          <w:cantSplit/>
+        </w:trPr>
+        <w:tc>
+          <w:tcPr>
+            <w:tcW w:type="dxa" w:w="4600"/>
+            <w:shd w:fill="FFFFFF" w:color="auto" w:val="clear"/>
+            <w:tcMar>
+              <w:top w:type="dxa" w:w="70"/>
+              <w:left w:type="dxa" w:w="120"/>
+              <w:bottom w:type="dxa" w:w="70"/>
+              <w:right w:type="dxa" w:w="120"/>
+            </w:tcMar>
+          </w:tcPr>
+          <w:p>
+            <w:pPr>
+              <w:spacing w:after="0"/>
+            </w:pPr>
+            <w:r>
+              <w:rPr>
+                <w:sz w:val="28"/>
+                <w:szCs w:val="28"/>
+              </w:rPr>
+              <w:t xml:space="preserve">สรุปสถานการณ์ของทีม SOC (5.2)</w:t>
+            </w:r>
+          </w:p>
+        </w:tc>
+        <w:tc>
+          <w:tcPr>
+            <w:tcW w:type="dxa" w:w="5000"/>
+            <w:shd w:fill="FFFFFF" w:color="auto" w:val="clear"/>
+            <w:tcMar>
+              <w:top w:type="dxa" w:w="70"/>
+              <w:left w:type="dxa" w:w="120"/>
+              <w:bottom w:type="dxa" w:w="70"/>
+              <w:right w:type="dxa" w:w="120"/>
+            </w:tcMar>
+          </w:tcPr>
+          <w:p>
+            <w:pPr>
+              <w:spacing w:after="0"/>
+            </w:pPr>
+            <w:r>
+              <w:rPr>
+                <w:b/>
+                <w:bCs/>
+                <w:sz w:val="28"/>
+                <w:szCs w:val="28"/>
+              </w:rPr>
+              <w:t xml:space="preserve">คิวปัจจุบันทั้งหมด ไม่ขึ้นกับตัวกรอง</w:t>
+            </w:r>
+            <w:r>
+              <w:rPr>
+                <w:sz w:val="28"/>
+                <w:szCs w:val="28"/>
+              </w:rPr>
+              <w:t xml:space="preserve"> (ป้าย “คิวปัจจุบัน · ทุกช่วงเวลา”)</w:t>
+            </w:r>
+          </w:p>
+        </w:tc>
+      </w:tr>
+      <w:tr>
+        <w:trPr>
+          <w:cantSplit/>
+        </w:trPr>
+        <w:tc>
+          <w:tcPr>
+            <w:tcW w:type="dxa" w:w="4600"/>
+            <w:shd w:fill="F7F8FA" w:color="auto" w:val="clear"/>
+            <w:tcMar>
+              <w:top w:type="dxa" w:w="70"/>
+              <w:left w:type="dxa" w:w="120"/>
+              <w:bottom w:type="dxa" w:w="70"/>
+              <w:right w:type="dxa" w:w="120"/>
+            </w:tcMar>
+          </w:tcPr>
+          <w:p>
+            <w:pPr>
+              <w:spacing w:after="0"/>
+            </w:pPr>
+            <w:r>
+              <w:rPr>
+                <w:sz w:val="28"/>
+                <w:szCs w:val="28"/>
+              </w:rPr>
+              <w:t xml:space="preserve">การ์ดเคสทั้งหมด (High/Critical) (5.3)</w:t>
+            </w:r>
+          </w:p>
+        </w:tc>
+        <w:tc>
+          <w:tcPr>
+            <w:tcW w:type="dxa" w:w="5000"/>
+            <w:shd w:fill="F7F8FA" w:color="auto" w:val="clear"/>
+            <w:tcMar>
+              <w:top w:type="dxa" w:w="70"/>
+              <w:left w:type="dxa" w:w="120"/>
+              <w:bottom w:type="dxa" w:w="70"/>
+              <w:right w:type="dxa" w:w="120"/>
+            </w:tcMar>
+          </w:tcPr>
+          <w:p>
+            <w:pPr>
+              <w:spacing w:after="0"/>
+            </w:pPr>
+            <w:r>
+              <w:rPr>
+                <w:b/>
+                <w:bCs/>
+                <w:sz w:val="28"/>
+                <w:szCs w:val="28"/>
+              </w:rPr>
+              <w:t xml:space="preserve">ทุกช่วงเวลา ไม่ขึ้นกับตัวกรอง</w:t>
+            </w:r>
+          </w:p>
+        </w:tc>
+      </w:tr>
+      <w:tr>
+        <w:trPr>
+          <w:cantSplit/>
+        </w:trPr>
+        <w:tc>
+          <w:tcPr>
+            <w:tcW w:type="dxa" w:w="4600"/>
+            <w:shd w:fill="FFFFFF" w:color="auto" w:val="clear"/>
+            <w:tcMar>
+              <w:top w:type="dxa" w:w="70"/>
+              <w:left w:type="dxa" w:w="120"/>
+              <w:bottom w:type="dxa" w:w="70"/>
+              <w:right w:type="dxa" w:w="120"/>
+            </w:tcMar>
+          </w:tcPr>
+          <w:p>
+            <w:pPr>
+              <w:spacing w:after="0"/>
+            </w:pPr>
+            <w:r>
+              <w:rPr>
+                <w:sz w:val="28"/>
+                <w:szCs w:val="28"/>
+              </w:rPr>
+              <w:t xml:space="preserve">การ์ด MTTR (5.3)</w:t>
+            </w:r>
+          </w:p>
+        </w:tc>
+        <w:tc>
+          <w:tcPr>
+            <w:tcW w:type="dxa" w:w="5000"/>
+            <w:shd w:fill="FFFFFF" w:color="auto" w:val="clear"/>
+            <w:tcMar>
+              <w:top w:type="dxa" w:w="70"/>
+              <w:left w:type="dxa" w:w="120"/>
+              <w:bottom w:type="dxa" w:w="70"/>
+              <w:right w:type="dxa" w:w="120"/>
+            </w:tcMar>
+          </w:tcPr>
+          <w:p>
+            <w:pPr>
+              <w:spacing w:after="0"/>
+            </w:pPr>
+            <w:r>
+              <w:rPr>
+                <w:sz w:val="28"/>
+                <w:szCs w:val="28"/>
+              </w:rPr>
+              <w:t xml:space="preserve">เคสที่ปิดใน 30 วันล่าสุดเสมอ</w:t>
+            </w:r>
+          </w:p>
+        </w:tc>
+      </w:tr>
+      <w:tr>
+        <w:trPr>
+          <w:cantSplit/>
+        </w:trPr>
+        <w:tc>
+          <w:tcPr>
+            <w:tcW w:type="dxa" w:w="4600"/>
+            <w:shd w:fill="F7F8FA" w:color="auto" w:val="clear"/>
+            <w:tcMar>
+              <w:top w:type="dxa" w:w="70"/>
+              <w:left w:type="dxa" w:w="120"/>
+              <w:bottom w:type="dxa" w:w="70"/>
+              <w:right w:type="dxa" w:w="120"/>
+            </w:tcMar>
+          </w:tcPr>
+          <w:p>
+            <w:pPr>
+              <w:spacing w:after="0"/>
+            </w:pPr>
+            <w:r>
+              <w:rPr>
+                <w:sz w:val="28"/>
+                <w:szCs w:val="28"/>
+              </w:rPr>
+              <w:t xml:space="preserve">ความคืบหน้าการปิดเคส, กราฟ Pipeline และตาราง Ticket (5.4–5.5, 5.7)</w:t>
+            </w:r>
+          </w:p>
+        </w:tc>
+        <w:tc>
+          <w:tcPr>
+            <w:tcW w:type="dxa" w:w="5000"/>
+            <w:shd w:fill="F7F8FA" w:color="auto" w:val="clear"/>
+            <w:tcMar>
+              <w:top w:type="dxa" w:w="70"/>
+              <w:left w:type="dxa" w:w="120"/>
+              <w:bottom w:type="dxa" w:w="70"/>
+              <w:right w:type="dxa" w:w="120"/>
+            </w:tcMar>
+          </w:tcPr>
+          <w:p>
+            <w:pPr>
+              <w:spacing w:after="0"/>
+            </w:pPr>
+            <w:r>
+              <w:rPr>
+                <w:b/>
+                <w:bCs/>
+                <w:sz w:val="28"/>
+                <w:szCs w:val="28"/>
+              </w:rPr>
+              <w:t xml:space="preserve">ตามช่วงเวลาที่เลือก</w:t>
+            </w:r>
+          </w:p>
+        </w:tc>
+      </w:tr>
+      <w:tr>
+        <w:trPr>
+          <w:cantSplit/>
+        </w:trPr>
+        <w:tc>
+          <w:tcPr>
+            <w:tcW w:type="dxa" w:w="4600"/>
+            <w:shd w:fill="FFFFFF" w:color="auto" w:val="clear"/>
+            <w:tcMar>
+              <w:top w:type="dxa" w:w="70"/>
+              <w:left w:type="dxa" w:w="120"/>
+              <w:bottom w:type="dxa" w:w="70"/>
+              <w:right w:type="dxa" w:w="120"/>
+            </w:tcMar>
+          </w:tcPr>
+          <w:p>
+            <w:pPr>
+              <w:spacing w:after="0"/>
+            </w:pPr>
+            <w:r>
+              <w:rPr>
+                <w:sz w:val="28"/>
+                <w:szCs w:val="28"/>
+              </w:rPr>
+              <w:t xml:space="preserve">ทีมตอบสนองเหตุการณ์ (5.6)</w:t>
+            </w:r>
+          </w:p>
+        </w:tc>
+        <w:tc>
+          <w:tcPr>
+            <w:tcW w:type="dxa" w:w="5000"/>
+            <w:shd w:fill="FFFFFF" w:color="auto" w:val="clear"/>
+            <w:tcMar>
+              <w:top w:type="dxa" w:w="70"/>
+              <w:left w:type="dxa" w:w="120"/>
+              <w:bottom w:type="dxa" w:w="70"/>
+              <w:right w:type="dxa" w:w="120"/>
+            </w:tcMar>
+          </w:tcPr>
+          <w:p>
+            <w:pPr>
+              <w:spacing w:after="0"/>
+            </w:pPr>
+            <w:r>
+              <w:rPr>
+                <w:sz w:val="28"/>
+                <w:szCs w:val="28"/>
+              </w:rPr>
+              <w:t xml:space="preserve">คำขอค้างใช้คิวปัจจุบัน ส่วนรับเข้า/ส่งงานใช้วันที่ของคำขอในช่วงเวลาที่เลือก</w:t>
+            </w:r>
+          </w:p>
+        </w:tc>
+      </w:tr>
+    </w:tbl>
+    <w:p>
+      <w:pPr>
+        <w:spacing w:after="140"/>
+      </w:pPr>
+    </w:p>
     <w:tbl>
       <w:tblPr>
         <w:tblW w:type="dxa" w:w="9600"/>
@@ -1319,7 +1987,7 @@
                 <w:sz w:val="32"/>
                 <w:szCs w:val="32"/>
               </w:rPr>
-              <w:t xml:space="preserve">ก่อนเปรียบเทียบตัวเลขสองชุด ให้ตรวจว่าเลือกช่วงเวลาเดียวกัน — ตัวเลขเกือบทั้งหมดบนหน้านี้เปลี่ยนตามตัวกรอง</w:t>
+              <w:t xml:space="preserve">ก่อนเปรียบเทียบตัวเลขสองชุด ให้ตรวจว่าเลือกช่วงเวลาเดียวกัน และจำไว้ว่าสรุปสถานการณ์กับการ์ดเคสทั้งหมดไม่เปลี่ยนตามตัวกรอง</w:t>
             </w:r>
           </w:p>
         </w:tc>
@@ -1342,7 +2010,7 @@
           <w:sz w:val="32"/>
           <w:szCs w:val="32"/>
         </w:rPr>
-        <w:t xml:space="preserve">กล่องซ้ายบนสรุปสถานการณ์รวมเป็นคำเดียว เพื่อให้ตอบได้ทันทีว่าต้องลงมาดูรายละเอียดหรือไม่</w:t>
+        <w:t xml:space="preserve">กล่องซ้ายบนสรุปสถานการณ์รวมเป็นคำเดียว เพื่อให้ตอบได้ทันทีว่าต้องลงมาดูรายละเอียดหรือไม่ กล่องนี้ดูจากคิวงานปัจจุบันทั้งหมด ไม่ขึ้นกับช่วงเวลาที่เลือก</w:t>
       </w:r>
     </w:p>
     <w:tbl>
@@ -1714,7 +2382,7 @@
           <w:sz w:val="32"/>
           <w:szCs w:val="32"/>
         </w:rPr>
-        <w:t xml:space="preserve">เคสที่รอทีมตอบสนอง (ผู้เชี่ยวชาญพิสูจน์หลักฐาน / ทีมทดสอบเจาะระบบ)</w:t>
+        <w:t xml:space="preserve">เคสที่รอทีมตอบสนอง (Forensic Analyst / Red Team Manager)</w:t>
       </w:r>
     </w:p>
     <w:p>
@@ -1890,7 +2558,7 @@
                 <w:sz w:val="32"/>
                 <w:szCs w:val="32"/>
               </w:rPr>
-              <w:t xml:space="preserve"> — กดแล้วตารางรายละเอียดด้านล่าง (ดู 5.6) จะกรองให้เหลือเฉพาะเคสกลุ่มนั้น เป็นวิธีเร็วที่สุดในการตอบคำถามว่า “ตอนนี้งานค้างอยู่ที่ใคร”</w:t>
+              <w:t xml:space="preserve"> — กดแล้วตารางรายละเอียดด้านล่าง (ดู 5.7) จะกรองให้เหลือเฉพาะเคสกลุ่มนั้น เป็นวิธีเร็วที่สุดในการตอบคำถามว่า “ตอนนี้งานค้างอยู่ที่ใคร” การกดจะเปลี่ยนช่วงเวลาเป็น ทั้งหมด ให้ด้วย เพื่อให้ตารางตรงกับจำนวนบนบรรทัดนั้น</w:t>
             </w:r>
           </w:p>
         </w:tc>
@@ -2000,7 +2668,7 @@
                 <w:sz w:val="32"/>
                 <w:szCs w:val="32"/>
               </w:rPr>
-              <w:t xml:space="preserve">เคสทั้งหมด (High/Critical)</w:t>
+              <w:t xml:space="preserve">เคสทั้งหมด (High/Critical) · ทุกช่วงเวลา</w:t>
             </w:r>
           </w:p>
         </w:tc>
@@ -2024,7 +2692,7 @@
                 <w:sz w:val="32"/>
                 <w:szCs w:val="32"/>
               </w:rPr>
-              <w:t xml:space="preserve">จำนวนเคสระดับสูงและวิกฤตในช่วงที่เลือก พร้อมเทียบกับเดือนก่อนหน้า (</w:t>
+              <w:t xml:space="preserve">จำนวนเคสระดับสูงและวิกฤต</w:t>
             </w:r>
             <w:r>
               <w:rPr>
@@ -2033,14 +2701,46 @@
                 <w:sz w:val="32"/>
                 <w:szCs w:val="32"/>
               </w:rPr>
-              <w:t xml:space="preserve">↑ / ↓ / เท่ากับเดือนที่แล้ว</w:t>
+              <w:t xml:space="preserve">ทั้งหมดตั้งแต่เริ่มใช้ระบบ</w:t>
             </w:r>
             <w:r>
               <w:rPr>
                 <w:sz w:val="32"/>
                 <w:szCs w:val="32"/>
               </w:rPr>
-              <w:t xml:space="preserve">)</w:t>
+              <w:t xml:space="preserve"> (ไม่ขึ้นกับตัวกรอง) เหตุการณ์ที่กระทบหลายระบบ (Project Incident) นับเป็นหนึ่งเหตุการณ์ ใต้ตัวเลขเทียบจำนวนเคสที่เปิด</w:t>
+            </w:r>
+            <w:r>
+              <w:rPr>
+                <w:b/>
+                <w:bCs/>
+                <w:sz w:val="32"/>
+                <w:szCs w:val="32"/>
+              </w:rPr>
+              <w:t xml:space="preserve">ตั้งแต่ต้นเดือนนี้ถึงวันนี้</w:t>
+            </w:r>
+            <w:r>
+              <w:rPr>
+                <w:sz w:val="32"/>
+                <w:szCs w:val="32"/>
+              </w:rPr>
+              <w:t xml:space="preserve"> กับ</w:t>
+            </w:r>
+            <w:r>
+              <w:rPr>
+                <w:b/>
+                <w:bCs/>
+                <w:sz w:val="32"/>
+                <w:szCs w:val="32"/>
+              </w:rPr>
+              <w:t xml:space="preserve">ช่วงวันเดียวกันของเดือนก่อน</w:t>
+            </w:r>
+            <w:r>
+              <w:rPr>
+                <w:sz w:val="32"/>
+                <w:szCs w:val="32"/>
+              </w:rPr>
+              <w:t xml:space="preserve"> (↑ / ↓ / เท่ากับช่วงเดียวกันเดือนก่อน)</w:t>
             </w:r>
           </w:p>
         </w:tc>
@@ -2296,7 +2996,7 @@
           <w:sz w:val="32"/>
           <w:szCs w:val="32"/>
         </w:rPr>
-        <w:t xml:space="preserve">แถบสัดส่วนแสดงว่าเคสระดับสูง/วิกฤต </w:t>
+        <w:t xml:space="preserve">แถบสัดส่วนแสดงว่าเคสระดับสูง/วิกฤตที่เปิดในช่วงเวลาที่เลือก </w:t>
       </w:r>
       <w:r>
         <w:rPr>
@@ -2328,7 +3028,7 @@
           <w:sz w:val="32"/>
           <w:szCs w:val="32"/>
         </w:rPr>
-        <w:t xml:space="preserve"> พร้อมจำนวนกำกับทั้งสองฝั่ง ใช้ดูว่าทีมตามงานทันหรือมีของค้างสะสม</w:t>
+        <w:t xml:space="preserve"> พร้อมจำนวนกำกับทั้งสองฝั่ง ใช้ดูว่าทีมตามงานทันหรือมีของค้างสะสม เคสที่ยกเลิกไม่ถูกนับ</w:t>
       </w:r>
     </w:p>
     <w:p>
@@ -2348,8 +3048,418 @@
           <w:sz w:val="32"/>
           <w:szCs w:val="32"/>
         </w:rPr>
-        <w:t xml:space="preserve">กราฟแท่งแนวนอนแสดงว่างานค้างอยู่ที่ขั้นตอนใดบ้าง ทำให้เห็นจุดคอขวดของกระบวนการ เช่น ค้างที่การควบคุมของผู้ดูแลระบบ หรือค้างที่ขั้นตรวจรับ</w:t>
-      </w:r>
+        <w:t xml:space="preserve">กราฟแท่งแนวนอนแสดงเคสระดับสูง/วิกฤตในช่วงเวลาที่เลือก จัดกลุ่มตาม </w:t>
+      </w:r>
+      <w:r>
+        <w:rPr>
+          <w:b/>
+          <w:bCs/>
+          <w:sz w:val="32"/>
+          <w:szCs w:val="32"/>
+        </w:rPr>
+        <w:t xml:space="preserve">ระยะของการตอบสนองต่อเหตุการณ์</w:t>
+      </w:r>
+      <w:r>
+        <w:rPr>
+          <w:sz w:val="32"/>
+          <w:szCs w:val="32"/>
+        </w:rPr>
+        <w:t xml:space="preserve"> (ไม่ใช่สถานะรายตัว) ทำให้เห็นว่างานกองอยู่ที่ระยะใด:</w:t>
+      </w:r>
+    </w:p>
+    <w:tbl>
+      <w:tblPr>
+        <w:tblW w:type="dxa" w:w="9600"/>
+        <w:tblBorders>
+          <w:top w:val="single" w:color="E1E6ED" w:sz="2"/>
+          <w:left w:val="single" w:color="E1E6ED" w:sz="2"/>
+          <w:bottom w:val="single" w:color="E1E6ED" w:sz="2"/>
+          <w:right w:val="single" w:color="E1E6ED" w:sz="2"/>
+          <w:insideH w:val="single" w:color="E1E6ED" w:sz="2"/>
+          <w:insideV w:val="single" w:color="E1E6ED" w:sz="2"/>
+        </w:tblBorders>
+      </w:tblPr>
+      <w:tblGrid>
+        <w:gridCol w:w="3400"/>
+        <w:gridCol w:w="6200"/>
+      </w:tblGrid>
+      <w:tr>
+        <w:trPr>
+          <w:cantSplit/>
+          <w:tblHeader/>
+        </w:trPr>
+        <w:tc>
+          <w:tcPr>
+            <w:tcW w:type="dxa" w:w="3400"/>
+            <w:shd w:fill="1A1A2E" w:color="auto" w:val="clear"/>
+            <w:tcMar>
+              <w:top w:type="dxa" w:w="80"/>
+              <w:left w:type="dxa" w:w="120"/>
+              <w:bottom w:type="dxa" w:w="80"/>
+              <w:right w:type="dxa" w:w="120"/>
+            </w:tcMar>
+          </w:tcPr>
+          <w:p>
+            <w:r>
+              <w:rPr>
+                <w:b/>
+                <w:bCs/>
+                <w:color w:val="FFFFFF"/>
+                <w:sz w:val="28"/>
+                <w:szCs w:val="28"/>
+              </w:rPr>
+              <w:t xml:space="preserve">ระยะ (ชื่อบนกราฟ)</w:t>
+            </w:r>
+          </w:p>
+        </w:tc>
+        <w:tc>
+          <w:tcPr>
+            <w:tcW w:type="dxa" w:w="6200"/>
+            <w:shd w:fill="1A1A2E" w:color="auto" w:val="clear"/>
+            <w:tcMar>
+              <w:top w:type="dxa" w:w="80"/>
+              <w:left w:type="dxa" w:w="120"/>
+              <w:bottom w:type="dxa" w:w="80"/>
+              <w:right w:type="dxa" w:w="120"/>
+            </w:tcMar>
+          </w:tcPr>
+          <w:p>
+            <w:r>
+              <w:rPr>
+                <w:b/>
+                <w:bCs/>
+                <w:color w:val="FFFFFF"/>
+                <w:sz w:val="28"/>
+                <w:szCs w:val="28"/>
+              </w:rPr>
+              <w:t xml:space="preserve">ครอบคลุม</w:t>
+            </w:r>
+          </w:p>
+        </w:tc>
+      </w:tr>
+      <w:tr>
+        <w:trPr>
+          <w:cantSplit/>
+        </w:trPr>
+        <w:tc>
+          <w:tcPr>
+            <w:tcW w:type="dxa" w:w="3400"/>
+            <w:shd w:fill="FFFFFF" w:color="auto" w:val="clear"/>
+            <w:tcMar>
+              <w:top w:type="dxa" w:w="70"/>
+              <w:left w:type="dxa" w:w="120"/>
+              <w:bottom w:type="dxa" w:w="70"/>
+              <w:right w:type="dxa" w:w="120"/>
+            </w:tcMar>
+          </w:tcPr>
+          <w:p>
+            <w:pPr>
+              <w:spacing w:after="0"/>
+            </w:pPr>
+            <w:r>
+              <w:rPr>
+                <w:sz w:val="28"/>
+                <w:szCs w:val="28"/>
+              </w:rPr>
+              <w:t xml:space="preserve">Preparation</w:t>
+            </w:r>
+          </w:p>
+        </w:tc>
+        <w:tc>
+          <w:tcPr>
+            <w:tcW w:type="dxa" w:w="6200"/>
+            <w:shd w:fill="FFFFFF" w:color="auto" w:val="clear"/>
+            <w:tcMar>
+              <w:top w:type="dxa" w:w="70"/>
+              <w:left w:type="dxa" w:w="120"/>
+              <w:bottom w:type="dxa" w:w="70"/>
+              <w:right w:type="dxa" w:w="120"/>
+            </w:tcMar>
+          </w:tcPr>
+          <w:p>
+            <w:pPr>
+              <w:spacing w:after="0"/>
+            </w:pPr>
+            <w:r>
+              <w:rPr>
+                <w:sz w:val="28"/>
+                <w:szCs w:val="28"/>
+              </w:rPr>
+              <w:t xml:space="preserve">ตั๋วที่ยังจัดเตรียม ยังไม่ส่งเข้ากระบวนการ</w:t>
+            </w:r>
+          </w:p>
+        </w:tc>
+      </w:tr>
+      <w:tr>
+        <w:trPr>
+          <w:cantSplit/>
+        </w:trPr>
+        <w:tc>
+          <w:tcPr>
+            <w:tcW w:type="dxa" w:w="3400"/>
+            <w:shd w:fill="F7F8FA" w:color="auto" w:val="clear"/>
+            <w:tcMar>
+              <w:top w:type="dxa" w:w="70"/>
+              <w:left w:type="dxa" w:w="120"/>
+              <w:bottom w:type="dxa" w:w="70"/>
+              <w:right w:type="dxa" w:w="120"/>
+            </w:tcMar>
+          </w:tcPr>
+          <w:p>
+            <w:pPr>
+              <w:spacing w:after="0"/>
+            </w:pPr>
+            <w:r>
+              <w:rPr>
+                <w:sz w:val="28"/>
+                <w:szCs w:val="28"/>
+              </w:rPr>
+              <w:t xml:space="preserve">Identification</w:t>
+            </w:r>
+          </w:p>
+        </w:tc>
+        <w:tc>
+          <w:tcPr>
+            <w:tcW w:type="dxa" w:w="6200"/>
+            <w:shd w:fill="F7F8FA" w:color="auto" w:val="clear"/>
+            <w:tcMar>
+              <w:top w:type="dxa" w:w="70"/>
+              <w:left w:type="dxa" w:w="120"/>
+              <w:bottom w:type="dxa" w:w="70"/>
+              <w:right w:type="dxa" w:w="120"/>
+            </w:tcMar>
+          </w:tcPr>
+          <w:p>
+            <w:pPr>
+              <w:spacing w:after="0"/>
+            </w:pPr>
+            <w:r>
+              <w:rPr>
+                <w:sz w:val="28"/>
+                <w:szCs w:val="28"/>
+              </w:rPr>
+              <w:t xml:space="preserve">กำลังวินิจฉัย: ส่งต่อ Tier 2, รอผู้จัดการ SOC ตรวจ, รอผู้จัดการตรวจการปิด Event, กำลังเฝ้าระวัง</w:t>
+            </w:r>
+          </w:p>
+        </w:tc>
+      </w:tr>
+      <w:tr>
+        <w:trPr>
+          <w:cantSplit/>
+        </w:trPr>
+        <w:tc>
+          <w:tcPr>
+            <w:tcW w:type="dxa" w:w="3400"/>
+            <w:shd w:fill="FFFFFF" w:color="auto" w:val="clear"/>
+            <w:tcMar>
+              <w:top w:type="dxa" w:w="70"/>
+              <w:left w:type="dxa" w:w="120"/>
+              <w:bottom w:type="dxa" w:w="70"/>
+              <w:right w:type="dxa" w:w="120"/>
+            </w:tcMar>
+          </w:tcPr>
+          <w:p>
+            <w:pPr>
+              <w:spacing w:after="0"/>
+            </w:pPr>
+            <w:r>
+              <w:rPr>
+                <w:sz w:val="28"/>
+                <w:szCs w:val="28"/>
+              </w:rPr>
+              <w:t xml:space="preserve">Containment/Eradication</w:t>
+            </w:r>
+          </w:p>
+        </w:tc>
+        <w:tc>
+          <w:tcPr>
+            <w:tcW w:type="dxa" w:w="6200"/>
+            <w:shd w:fill="FFFFFF" w:color="auto" w:val="clear"/>
+            <w:tcMar>
+              <w:top w:type="dxa" w:w="70"/>
+              <w:left w:type="dxa" w:w="120"/>
+              <w:bottom w:type="dxa" w:w="70"/>
+              <w:right w:type="dxa" w:w="120"/>
+            </w:tcMar>
+          </w:tcPr>
+          <w:p>
+            <w:pPr>
+              <w:spacing w:after="0"/>
+            </w:pPr>
+            <w:r>
+              <w:rPr>
+                <w:sz w:val="28"/>
+                <w:szCs w:val="28"/>
+              </w:rPr>
+              <w:t xml:space="preserve">กำลังควบคุม/แก้ไข: รอผู้ดูแลระบบ, รายงานการควบคุมแล้ว, รอเจ้าของระบบ</w:t>
+            </w:r>
+          </w:p>
+        </w:tc>
+      </w:tr>
+      <w:tr>
+        <w:trPr>
+          <w:cantSplit/>
+        </w:trPr>
+        <w:tc>
+          <w:tcPr>
+            <w:tcW w:type="dxa" w:w="3400"/>
+            <w:shd w:fill="F7F8FA" w:color="auto" w:val="clear"/>
+            <w:tcMar>
+              <w:top w:type="dxa" w:w="70"/>
+              <w:left w:type="dxa" w:w="120"/>
+              <w:bottom w:type="dxa" w:w="70"/>
+              <w:right w:type="dxa" w:w="120"/>
+            </w:tcMar>
+          </w:tcPr>
+          <w:p>
+            <w:pPr>
+              <w:spacing w:after="0"/>
+            </w:pPr>
+            <w:r>
+              <w:rPr>
+                <w:sz w:val="28"/>
+                <w:szCs w:val="28"/>
+              </w:rPr>
+              <w:t xml:space="preserve">Recovery</w:t>
+            </w:r>
+          </w:p>
+        </w:tc>
+        <w:tc>
+          <w:tcPr>
+            <w:tcW w:type="dxa" w:w="6200"/>
+            <w:shd w:fill="F7F8FA" w:color="auto" w:val="clear"/>
+            <w:tcMar>
+              <w:top w:type="dxa" w:w="70"/>
+              <w:left w:type="dxa" w:w="120"/>
+              <w:bottom w:type="dxa" w:w="70"/>
+              <w:right w:type="dxa" w:w="120"/>
+            </w:tcMar>
+          </w:tcPr>
+          <w:p>
+            <w:pPr>
+              <w:spacing w:after="0"/>
+            </w:pPr>
+            <w:r>
+              <w:rPr>
+                <w:sz w:val="28"/>
+                <w:szCs w:val="28"/>
+              </w:rPr>
+              <w:t xml:space="preserve">งานเสร็จแล้ว รอตรวจรับหรืออนุมัติปิด</w:t>
+            </w:r>
+          </w:p>
+        </w:tc>
+      </w:tr>
+      <w:tr>
+        <w:trPr>
+          <w:cantSplit/>
+        </w:trPr>
+        <w:tc>
+          <w:tcPr>
+            <w:tcW w:type="dxa" w:w="3400"/>
+            <w:shd w:fill="FFFFFF" w:color="auto" w:val="clear"/>
+            <w:tcMar>
+              <w:top w:type="dxa" w:w="70"/>
+              <w:left w:type="dxa" w:w="120"/>
+              <w:bottom w:type="dxa" w:w="70"/>
+              <w:right w:type="dxa" w:w="120"/>
+            </w:tcMar>
+          </w:tcPr>
+          <w:p>
+            <w:pPr>
+              <w:spacing w:after="0"/>
+            </w:pPr>
+            <w:r>
+              <w:rPr>
+                <w:sz w:val="28"/>
+                <w:szCs w:val="28"/>
+              </w:rPr>
+              <w:t xml:space="preserve">Lessons Learned</w:t>
+            </w:r>
+          </w:p>
+        </w:tc>
+        <w:tc>
+          <w:tcPr>
+            <w:tcW w:type="dxa" w:w="6200"/>
+            <w:shd w:fill="FFFFFF" w:color="auto" w:val="clear"/>
+            <w:tcMar>
+              <w:top w:type="dxa" w:w="70"/>
+              <w:left w:type="dxa" w:w="120"/>
+              <w:bottom w:type="dxa" w:w="70"/>
+              <w:right w:type="dxa" w:w="120"/>
+            </w:tcMar>
+          </w:tcPr>
+          <w:p>
+            <w:pPr>
+              <w:spacing w:after="0"/>
+            </w:pPr>
+            <w:r>
+              <w:rPr>
+                <w:sz w:val="28"/>
+                <w:szCs w:val="28"/>
+              </w:rPr>
+              <w:t xml:space="preserve">ปิดแล้ว (อนุมัติ หรือปิดเป็น Event)</w:t>
+            </w:r>
+          </w:p>
+        </w:tc>
+      </w:tr>
+      <w:tr>
+        <w:trPr>
+          <w:cantSplit/>
+        </w:trPr>
+        <w:tc>
+          <w:tcPr>
+            <w:tcW w:type="dxa" w:w="3400"/>
+            <w:shd w:fill="F7F8FA" w:color="auto" w:val="clear"/>
+            <w:tcMar>
+              <w:top w:type="dxa" w:w="70"/>
+              <w:left w:type="dxa" w:w="120"/>
+              <w:bottom w:type="dxa" w:w="70"/>
+              <w:right w:type="dxa" w:w="120"/>
+            </w:tcMar>
+          </w:tcPr>
+          <w:p>
+            <w:pPr>
+              <w:spacing w:after="0"/>
+            </w:pPr>
+            <w:r>
+              <w:rPr>
+                <w:sz w:val="28"/>
+                <w:szCs w:val="28"/>
+              </w:rPr>
+              <w:t xml:space="preserve">ยกเลิกแล้ว</w:t>
+            </w:r>
+          </w:p>
+        </w:tc>
+        <w:tc>
+          <w:tcPr>
+            <w:tcW w:type="dxa" w:w="6200"/>
+            <w:shd w:fill="F7F8FA" w:color="auto" w:val="clear"/>
+            <w:tcMar>
+              <w:top w:type="dxa" w:w="70"/>
+              <w:left w:type="dxa" w:w="120"/>
+              <w:bottom w:type="dxa" w:w="70"/>
+              <w:right w:type="dxa" w:w="120"/>
+            </w:tcMar>
+          </w:tcPr>
+          <w:p>
+            <w:pPr>
+              <w:spacing w:after="0"/>
+            </w:pPr>
+            <w:r>
+              <w:rPr>
+                <w:sz w:val="28"/>
+                <w:szCs w:val="28"/>
+              </w:rPr>
+              <w:t xml:space="preserve">ตั๋วที่ถูกยกเลิก</w:t>
+            </w:r>
+          </w:p>
+        </w:tc>
+      </w:tr>
+    </w:tbl>
+    <w:p>
+      <w:pPr>
+        <w:spacing w:after="140"/>
+      </w:pPr>
     </w:p>
     <w:tbl>
       <w:tblPr>
@@ -2496,14 +3606,14 @@
           </w:p>
           <w:p>
             <w:pPr>
-              <w:spacing w:after="0"/>
+              <w:spacing w:after="60"/>
             </w:pPr>
             <w:r>
               <w:rPr>
                 <w:sz w:val="32"/>
                 <w:szCs w:val="32"/>
               </w:rPr>
-              <w:t xml:space="preserve">ชื่อสถานะที่แสดงเป็น </w:t>
+              <w:t xml:space="preserve">ชื่อระยะที่แสดงเป็น </w:t>
             </w:r>
             <w:r>
               <w:rPr>
@@ -2523,6 +3633,27 @@
               <w:t xml:space="preserve"> หมายถึงในกลุ่มนั้นมีเคสฉุกเฉินรวมอยู่ด้วย — เลื่อนเมาส์ไปบนแท่งเพื่อดูจำนวนแยกตามระดับ</w:t>
             </w:r>
           </w:p>
+          <w:p>
+            <w:pPr>
+              <w:spacing w:after="0"/>
+            </w:pPr>
+            <w:r>
+              <w:rPr>
+                <w:b/>
+                <w:bCs/>
+                <w:sz w:val="32"/>
+                <w:szCs w:val="32"/>
+              </w:rPr>
+              <w:t xml:space="preserve">กดที่แท่ง</w:t>
+            </w:r>
+            <w:r>
+              <w:rPr>
+                <w:sz w:val="32"/>
+                <w:szCs w:val="32"/>
+              </w:rPr>
+              <w:t xml:space="preserve"> เพื่อกรองตารางรายละเอียด (5.7) ให้เหลือเฉพาะเคสในระยะนั้น โดยยังใช้ช่วงเวลาเดิม</w:t>
+            </w:r>
+          </w:p>
         </w:tc>
       </w:tr>
     </w:tbl>
@@ -2531,7 +3662,7 @@
         <w:pStyle w:val="Heading2"/>
       </w:pPr>
       <w:r>
-        <w:t xml:space="preserve">5.6 ตารางรายละเอียด Ticket</w:t>
+        <w:t xml:space="preserve">5.6 ความคืบหน้าทีมตอบสนองเหตุการณ์</w:t>
       </w:r>
     </w:p>
     <w:p>
@@ -2543,144 +3674,320 @@
           <w:sz w:val="32"/>
           <w:szCs w:val="32"/>
         </w:rPr>
-        <w:t xml:space="preserve">ตารางท้ายหน้าแสดงรายเคส: </w:t>
-      </w:r>
-      <w:r>
-        <w:rPr>
-          <w:b/>
-          <w:bCs/>
-          <w:color w:val="1F2D3D"/>
-          <w:sz w:val="32"/>
-          <w:szCs w:val="32"/>
-        </w:rPr>
-        <w:t xml:space="preserve">เลขที่เคส (ID)</w:t>
-      </w:r>
-      <w:r>
-        <w:rPr>
-          <w:sz w:val="32"/>
-          <w:szCs w:val="32"/>
-        </w:rPr>
-        <w:t xml:space="preserve">, </w:t>
-      </w:r>
-      <w:r>
-        <w:rPr>
-          <w:b/>
-          <w:bCs/>
-          <w:color w:val="1F2D3D"/>
-          <w:sz w:val="32"/>
-          <w:szCs w:val="32"/>
-        </w:rPr>
-        <w:t xml:space="preserve">รายละเอียด</w:t>
-      </w:r>
-      <w:r>
-        <w:rPr>
-          <w:sz w:val="32"/>
-          <w:szCs w:val="32"/>
-        </w:rPr>
-        <w:t xml:space="preserve">, </w:t>
-      </w:r>
-      <w:r>
-        <w:rPr>
-          <w:b/>
-          <w:bCs/>
-          <w:color w:val="1F2D3D"/>
-          <w:sz w:val="32"/>
-          <w:szCs w:val="32"/>
-        </w:rPr>
-        <w:t xml:space="preserve">ผู้รับผิดชอบ</w:t>
-      </w:r>
-      <w:r>
-        <w:rPr>
-          <w:sz w:val="32"/>
-          <w:szCs w:val="32"/>
-        </w:rPr>
-        <w:t xml:space="preserve">, </w:t>
-      </w:r>
-      <w:r>
-        <w:rPr>
-          <w:b/>
-          <w:bCs/>
-          <w:color w:val="1F2D3D"/>
-          <w:sz w:val="32"/>
-          <w:szCs w:val="32"/>
-        </w:rPr>
-        <w:t xml:space="preserve">สถานะ Emergency</w:t>
-      </w:r>
-      <w:r>
-        <w:rPr>
-          <w:sz w:val="32"/>
-          <w:szCs w:val="32"/>
-        </w:rPr>
-        <w:t xml:space="preserve">, </w:t>
-      </w:r>
-      <w:r>
-        <w:rPr>
-          <w:b/>
-          <w:bCs/>
-          <w:color w:val="1F2D3D"/>
-          <w:sz w:val="32"/>
-          <w:szCs w:val="32"/>
-        </w:rPr>
-        <w:t xml:space="preserve">สถานะ</w:t>
-      </w:r>
-      <w:r>
-        <w:rPr>
-          <w:sz w:val="32"/>
-          <w:szCs w:val="32"/>
-        </w:rPr>
-        <w:t xml:space="preserve"> และ </w:t>
-      </w:r>
-      <w:r>
-        <w:rPr>
-          <w:b/>
-          <w:bCs/>
-          <w:color w:val="1F2D3D"/>
-          <w:sz w:val="32"/>
-          <w:szCs w:val="32"/>
-        </w:rPr>
-        <w:t xml:space="preserve">อัปเดตล่าสุด</w:t>
-      </w:r>
-      <w:r>
-        <w:rPr>
-          <w:sz w:val="32"/>
-          <w:szCs w:val="32"/>
-        </w:rPr>
-        <w:t xml:space="preserve"> เมื่อคุณกดเงื่อนไขในข้อ 5.2 ตารางจะขึ้นป้าย </w:t>
-      </w:r>
-      <w:r>
-        <w:rPr>
-          <w:b/>
-          <w:bCs/>
-          <w:color w:val="1F2D3D"/>
-          <w:sz w:val="32"/>
-          <w:szCs w:val="32"/>
-        </w:rPr>
-        <w:t xml:space="preserve">ตัวกรอง</w:t>
-      </w:r>
-      <w:r>
-        <w:rPr>
-          <w:sz w:val="32"/>
-          <w:szCs w:val="32"/>
-        </w:rPr>
-        <w:t xml:space="preserve"> บอกว่ากำลังกรองอะไรอยู่ กด </w:t>
-      </w:r>
-      <w:r>
-        <w:rPr>
-          <w:b/>
-          <w:bCs/>
-          <w:color w:val="1F2D3D"/>
-          <w:sz w:val="32"/>
-          <w:szCs w:val="32"/>
-        </w:rPr>
-        <w:t xml:space="preserve">ล้างตัวกรอง</w:t>
-      </w:r>
-      <w:r>
-        <w:rPr>
-          <w:sz w:val="32"/>
-          <w:szCs w:val="32"/>
-        </w:rPr>
-        <w:t xml:space="preserve"> เพื่อกลับไปดูทั้งหมด</w:t>
-      </w:r>
+        <w:t xml:space="preserve">ส่วนนี้อยู่ใต้กราฟ Pipeline แสดงความคืบหน้าของคำขอ VA, PenTest, Hardening และ Forensics / RCA โดยแยก VA/PT เดิมไว้ต่างหาก เพราะคำขอเดิมไม่ได้ระบุว่าเป็น VA หรือ PenTest</w:t>
+      </w:r>
+    </w:p>
+    <w:tbl>
+      <w:tblPr>
+        <w:tblW w:type="dxa" w:w="9600"/>
+        <w:tblBorders>
+          <w:top w:val="single" w:color="E1E6ED" w:sz="2"/>
+          <w:left w:val="single" w:color="E1E6ED" w:sz="2"/>
+          <w:bottom w:val="single" w:color="E1E6ED" w:sz="2"/>
+          <w:right w:val="single" w:color="E1E6ED" w:sz="2"/>
+          <w:insideH w:val="single" w:color="E1E6ED" w:sz="2"/>
+          <w:insideV w:val="single" w:color="E1E6ED" w:sz="2"/>
+        </w:tblBorders>
+      </w:tblPr>
+      <w:tblGrid>
+        <w:gridCol w:w="3400"/>
+        <w:gridCol w:w="6200"/>
+      </w:tblGrid>
+      <w:tr>
+        <w:trPr>
+          <w:cantSplit/>
+          <w:tblHeader/>
+        </w:trPr>
+        <w:tc>
+          <w:tcPr>
+            <w:tcW w:type="dxa" w:w="3400"/>
+            <w:shd w:fill="1A1A2E" w:color="auto" w:val="clear"/>
+            <w:tcMar>
+              <w:top w:type="dxa" w:w="80"/>
+              <w:left w:type="dxa" w:w="120"/>
+              <w:bottom w:type="dxa" w:w="80"/>
+              <w:right w:type="dxa" w:w="120"/>
+            </w:tcMar>
+          </w:tcPr>
+          <w:p>
+            <w:r>
+              <w:rPr>
+                <w:b/>
+                <w:bCs/>
+                <w:color w:val="FFFFFF"/>
+                <w:sz w:val="28"/>
+                <w:szCs w:val="28"/>
+              </w:rPr>
+              <w:t xml:space="preserve">ตัวเลข</w:t>
+            </w:r>
+          </w:p>
+        </w:tc>
+        <w:tc>
+          <w:tcPr>
+            <w:tcW w:type="dxa" w:w="6200"/>
+            <w:shd w:fill="1A1A2E" w:color="auto" w:val="clear"/>
+            <w:tcMar>
+              <w:top w:type="dxa" w:w="80"/>
+              <w:left w:type="dxa" w:w="120"/>
+              <w:bottom w:type="dxa" w:w="80"/>
+              <w:right w:type="dxa" w:w="120"/>
+            </w:tcMar>
+          </w:tcPr>
+          <w:p>
+            <w:r>
+              <w:rPr>
+                <w:b/>
+                <w:bCs/>
+                <w:color w:val="FFFFFF"/>
+                <w:sz w:val="28"/>
+                <w:szCs w:val="28"/>
+              </w:rPr>
+              <w:t xml:space="preserve">ความหมาย</w:t>
+            </w:r>
+          </w:p>
+        </w:tc>
+      </w:tr>
+      <w:tr>
+        <w:trPr>
+          <w:cantSplit/>
+        </w:trPr>
+        <w:tc>
+          <w:tcPr>
+            <w:tcW w:type="dxa" w:w="3400"/>
+            <w:shd w:fill="FFFFFF" w:color="auto" w:val="clear"/>
+            <w:tcMar>
+              <w:top w:type="dxa" w:w="70"/>
+              <w:left w:type="dxa" w:w="120"/>
+              <w:bottom w:type="dxa" w:w="70"/>
+              <w:right w:type="dxa" w:w="120"/>
+            </w:tcMar>
+          </w:tcPr>
+          <w:p>
+            <w:pPr>
+              <w:spacing w:after="0"/>
+            </w:pPr>
+            <w:r>
+              <w:rPr>
+                <w:sz w:val="28"/>
+                <w:szCs w:val="28"/>
+              </w:rPr>
+              <w:t xml:space="preserve">คำขอที่ค้างอยู่</w:t>
+            </w:r>
+          </w:p>
+        </w:tc>
+        <w:tc>
+          <w:tcPr>
+            <w:tcW w:type="dxa" w:w="6200"/>
+            <w:shd w:fill="FFFFFF" w:color="auto" w:val="clear"/>
+            <w:tcMar>
+              <w:top w:type="dxa" w:w="70"/>
+              <w:left w:type="dxa" w:w="120"/>
+              <w:bottom w:type="dxa" w:w="70"/>
+              <w:right w:type="dxa" w:w="120"/>
+            </w:tcMar>
+          </w:tcPr>
+          <w:p>
+            <w:pPr>
+              <w:spacing w:after="0"/>
+            </w:pPr>
+            <w:r>
+              <w:rPr>
+                <w:sz w:val="28"/>
+                <w:szCs w:val="28"/>
+              </w:rPr>
+              <w:t xml:space="preserve">คำขอที่เปิดหรือกำลังดำเนินการบน Ticket ที่ยังไม่ปิด นับคิวปัจจุบัน ไม่เปลี่ยนตามช่วงเวลา</w:t>
+            </w:r>
+          </w:p>
+        </w:tc>
+      </w:tr>
+      <w:tr>
+        <w:trPr>
+          <w:cantSplit/>
+        </w:trPr>
+        <w:tc>
+          <w:tcPr>
+            <w:tcW w:type="dxa" w:w="3400"/>
+            <w:shd w:fill="F7F8FA" w:color="auto" w:val="clear"/>
+            <w:tcMar>
+              <w:top w:type="dxa" w:w="70"/>
+              <w:left w:type="dxa" w:w="120"/>
+              <w:bottom w:type="dxa" w:w="70"/>
+              <w:right w:type="dxa" w:w="120"/>
+            </w:tcMar>
+          </w:tcPr>
+          <w:p>
+            <w:pPr>
+              <w:spacing w:after="0"/>
+            </w:pPr>
+            <w:r>
+              <w:rPr>
+                <w:sz w:val="28"/>
+                <w:szCs w:val="28"/>
+              </w:rPr>
+              <w:t xml:space="preserve">รับเข้าช่วงเวลานี้</w:t>
+            </w:r>
+          </w:p>
+        </w:tc>
+        <w:tc>
+          <w:tcPr>
+            <w:tcW w:type="dxa" w:w="6200"/>
+            <w:shd w:fill="F7F8FA" w:color="auto" w:val="clear"/>
+            <w:tcMar>
+              <w:top w:type="dxa" w:w="70"/>
+              <w:left w:type="dxa" w:w="120"/>
+              <w:bottom w:type="dxa" w:w="70"/>
+              <w:right w:type="dxa" w:w="120"/>
+            </w:tcMar>
+          </w:tcPr>
+          <w:p>
+            <w:pPr>
+              <w:spacing w:after="0"/>
+            </w:pPr>
+            <w:r>
+              <w:rPr>
+                <w:sz w:val="28"/>
+                <w:szCs w:val="28"/>
+              </w:rPr>
+              <w:t xml:space="preserve">คำขอที่สร้างในช่วงเวลาที่เลือก รวมคำขอที่ส่งงานหรือยกเลิกแล้ว</w:t>
+            </w:r>
+          </w:p>
+        </w:tc>
+      </w:tr>
+      <w:tr>
+        <w:trPr>
+          <w:cantSplit/>
+        </w:trPr>
+        <w:tc>
+          <w:tcPr>
+            <w:tcW w:type="dxa" w:w="3400"/>
+            <w:shd w:fill="FFFFFF" w:color="auto" w:val="clear"/>
+            <w:tcMar>
+              <w:top w:type="dxa" w:w="70"/>
+              <w:left w:type="dxa" w:w="120"/>
+              <w:bottom w:type="dxa" w:w="70"/>
+              <w:right w:type="dxa" w:w="120"/>
+            </w:tcMar>
+          </w:tcPr>
+          <w:p>
+            <w:pPr>
+              <w:spacing w:after="0"/>
+            </w:pPr>
+            <w:r>
+              <w:rPr>
+                <w:sz w:val="28"/>
+                <w:szCs w:val="28"/>
+              </w:rPr>
+              <w:t xml:space="preserve">ส่งงานช่วงเวลานี้</w:t>
+            </w:r>
+          </w:p>
+        </w:tc>
+        <w:tc>
+          <w:tcPr>
+            <w:tcW w:type="dxa" w:w="6200"/>
+            <w:shd w:fill="FFFFFF" w:color="auto" w:val="clear"/>
+            <w:tcMar>
+              <w:top w:type="dxa" w:w="70"/>
+              <w:left w:type="dxa" w:w="120"/>
+              <w:bottom w:type="dxa" w:w="70"/>
+              <w:right w:type="dxa" w:w="120"/>
+            </w:tcMar>
+          </w:tcPr>
+          <w:p>
+            <w:pPr>
+              <w:spacing w:after="0"/>
+            </w:pPr>
+            <w:r>
+              <w:rPr>
+                <w:sz w:val="28"/>
+                <w:szCs w:val="28"/>
+              </w:rPr>
+              <w:t xml:space="preserve">คำขอที่มีสถานะเสร็จสิ้นและเปลี่ยนเป็นสถานะนั้นในช่วงเวลาที่เลือก ข้อมูลเดิมบางรายการอาจใช้วันที่อัปเดตล่าสุดแทน</w:t>
+            </w:r>
+          </w:p>
+        </w:tc>
+      </w:tr>
+      <w:tr>
+        <w:trPr>
+          <w:cantSplit/>
+        </w:trPr>
+        <w:tc>
+          <w:tcPr>
+            <w:tcW w:type="dxa" w:w="3400"/>
+            <w:shd w:fill="F7F8FA" w:color="auto" w:val="clear"/>
+            <w:tcMar>
+              <w:top w:type="dxa" w:w="70"/>
+              <w:left w:type="dxa" w:w="120"/>
+              <w:bottom w:type="dxa" w:w="70"/>
+              <w:right w:type="dxa" w:w="120"/>
+            </w:tcMar>
+          </w:tcPr>
+          <w:p>
+            <w:pPr>
+              <w:spacing w:after="0"/>
+            </w:pPr>
+            <w:r>
+              <w:rPr>
+                <w:sz w:val="28"/>
+                <w:szCs w:val="28"/>
+              </w:rPr>
+              <w:t xml:space="preserve">Ticket High/Critical ที่รอทีมตอบสนอง</w:t>
+            </w:r>
+          </w:p>
+        </w:tc>
+        <w:tc>
+          <w:tcPr>
+            <w:tcW w:type="dxa" w:w="6200"/>
+            <w:shd w:fill="F7F8FA" w:color="auto" w:val="clear"/>
+            <w:tcMar>
+              <w:top w:type="dxa" w:w="70"/>
+              <w:left w:type="dxa" w:w="120"/>
+              <w:bottom w:type="dxa" w:w="70"/>
+              <w:right w:type="dxa" w:w="120"/>
+            </w:tcMar>
+          </w:tcPr>
+          <w:p>
+            <w:pPr>
+              <w:spacing w:after="0"/>
+            </w:pPr>
+            <w:r>
+              <w:rPr>
+                <w:sz w:val="28"/>
+                <w:szCs w:val="28"/>
+              </w:rPr>
+              <w:t xml:space="preserve">จำนวน Ticket ระดับ High/Critical ที่มีคำขอค้างอย่างน้อยหนึ่งรายการ นับ Ticket ไม่ซ้ำ</w:t>
+            </w:r>
+          </w:p>
+        </w:tc>
+      </w:tr>
+    </w:tbl>
+    <w:p>
+      <w:pPr>
+        <w:spacing w:after="120"/>
+      </w:pPr>
+      <w:r>
+        <w:rPr>
+          <w:sz w:val="32"/>
+          <w:szCs w:val="32"/>
+        </w:rPr>
+        <w:t xml:space="preserve">ตารางฟังก์ชันแสดงผู้จัดการ Red Team ที่กำหนดไว้ในระบบ พร้อมจำนวนค้าง เกิน 7 วัน รับเข้า และส่งงาน กดชื่อฟังก์ชันหรือตัวเลขเพื่อกรองรายการคำขอด้านล่าง งานเกิน 7 วันนับตั้งแต่สร้างคำขอ เป็นตัวช่วยดูงานค้าง ไม่ใช่การเกิน OLA</w:t>
+      </w:r>
+    </w:p>
+    <w:p>
+      <w:pPr>
+        <w:spacing w:after="120"/>
+      </w:pPr>
+      <w:r>
+        <w:rPr>
+          <w:sz w:val="32"/>
+          <w:szCs w:val="32"/>
+        </w:rPr>
+        <w:t xml:space="preserve">รายการคำขอแสดงเลขที่ Ticket และชื่อเรื่องแยกกันสองคอลัมน์ ตามด้วยระดับความรุนแรง ฟังก์ชัน ผู้รับผิดชอบ สถานะ อายุคำขอ และวันที่รับเข้า/ส่งงาน อายุของงานค้างนับถึงปัจจุบัน ส่วนงานที่เสร็จหรือยกเลิกนับถึงวันเปลี่ยนสถานะ กดปุ่ม ค้างทั้งหมด รอรับงาน กำลังทำ หรือ ส่งงานแล้ว เพื่อเปลี่ยนสถานะที่ดู คำขอที่ส่งงานแล้วใช้ช่วงเวลาที่เลือก สามารถกด ทุกฟังก์ชัน เพื่อล้างตัวกรองฟังก์ชัน และใช้ปุ่มก่อนหน้า/ถัดไปเพื่อดูรายการอื่น</w:t>
+      </w:r>
+    </w:p>
+    <w:p>
+      <w:pPr>
+        <w:spacing w:after="140"/>
+      </w:pPr>
     </w:p>
     <w:tbl>
       <w:tblPr>
@@ -2737,7 +4044,7 @@
                 <w:sz w:val="32"/>
                 <w:szCs w:val="32"/>
               </w:rPr>
-              <w:t xml:space="preserve">ตารางรายละเอียด Ticket พร้อมป้ายตัวกรองและปุ่มล้างตัวกรอง</w:t>
+              <w:t xml:space="preserve">ความคืบหน้าทีมตอบสนองและตัวกรองรายการคำขอ</w:t>
             </w:r>
           </w:p>
           <w:p>
@@ -2751,7 +4058,7 @@
                 <w:sz w:val="24"/>
                 <w:szCs w:val="24"/>
               </w:rPr>
-              <w:t xml:space="preserve">SHOT: EXE-ticket-table</w:t>
+              <w:t xml:space="preserve">SHOT: EXE-response-progress</w:t>
             </w:r>
           </w:p>
         </w:tc>
@@ -2771,6 +4078,309 @@
           <w:szCs w:val="28"/>
         </w:rPr>
         <w:t xml:space="preserve">รูปที่ 5-5  </w:t>
+      </w:r>
+      <w:r>
+        <w:rPr>
+          <w:i/>
+          <w:iCs/>
+          <w:color w:val="6C7888"/>
+          <w:sz w:val="28"/>
+          <w:szCs w:val="28"/>
+        </w:rPr>
+        <w:t xml:space="preserve">ความคืบหน้าทีมตอบสนองและตัวกรองรายการคำขอ</w:t>
+      </w:r>
+    </w:p>
+    <w:p>
+      <w:pPr>
+        <w:pStyle w:val="Heading2"/>
+      </w:pPr>
+      <w:r>
+        <w:t xml:space="preserve">5.7 ตารางรายละเอียด Ticket</w:t>
+      </w:r>
+    </w:p>
+    <w:p>
+      <w:pPr>
+        <w:spacing w:after="120"/>
+      </w:pPr>
+      <w:r>
+        <w:rPr>
+          <w:sz w:val="32"/>
+          <w:szCs w:val="32"/>
+        </w:rPr>
+        <w:t xml:space="preserve">ตารางท้ายหน้าแสดงเคสที่ยังไม่ปิดในช่วงเวลาที่เลือก หน้าละ 10 เรื่อง เรียงเคสที่ค้างในสถานะปัจจุบันนานที่สุดขึ้นก่อน คอลัมน์ได้แก่ </w:t>
+      </w:r>
+      <w:r>
+        <w:rPr>
+          <w:b/>
+          <w:bCs/>
+          <w:color w:val="1F2D3D"/>
+          <w:sz w:val="32"/>
+          <w:szCs w:val="32"/>
+        </w:rPr>
+        <w:t xml:space="preserve">เลขที่ Ticket</w:t>
+      </w:r>
+      <w:r>
+        <w:rPr>
+          <w:sz w:val="32"/>
+          <w:szCs w:val="32"/>
+        </w:rPr>
+        <w:t xml:space="preserve">, </w:t>
+      </w:r>
+      <w:r>
+        <w:rPr>
+          <w:b/>
+          <w:bCs/>
+          <w:color w:val="1F2D3D"/>
+          <w:sz w:val="32"/>
+          <w:szCs w:val="32"/>
+        </w:rPr>
+        <w:t xml:space="preserve">ชื่อเรื่อง</w:t>
+      </w:r>
+      <w:r>
+        <w:rPr>
+          <w:sz w:val="32"/>
+          <w:szCs w:val="32"/>
+        </w:rPr>
+        <w:t xml:space="preserve">, </w:t>
+      </w:r>
+      <w:r>
+        <w:rPr>
+          <w:b/>
+          <w:bCs/>
+          <w:color w:val="1F2D3D"/>
+          <w:sz w:val="32"/>
+          <w:szCs w:val="32"/>
+        </w:rPr>
+        <w:t xml:space="preserve">สรุปเหตุการณ์</w:t>
+      </w:r>
+      <w:r>
+        <w:rPr>
+          <w:sz w:val="32"/>
+          <w:szCs w:val="32"/>
+        </w:rPr>
+        <w:t xml:space="preserve">, </w:t>
+      </w:r>
+      <w:r>
+        <w:rPr>
+          <w:b/>
+          <w:bCs/>
+          <w:color w:val="1F2D3D"/>
+          <w:sz w:val="32"/>
+          <w:szCs w:val="32"/>
+        </w:rPr>
+        <w:t xml:space="preserve">ผู้รับผิดชอบ</w:t>
+      </w:r>
+      <w:r>
+        <w:rPr>
+          <w:sz w:val="32"/>
+          <w:szCs w:val="32"/>
+        </w:rPr>
+        <w:t xml:space="preserve">, </w:t>
+      </w:r>
+      <w:r>
+        <w:rPr>
+          <w:b/>
+          <w:bCs/>
+          <w:color w:val="1F2D3D"/>
+          <w:sz w:val="32"/>
+          <w:szCs w:val="32"/>
+        </w:rPr>
+        <w:t xml:space="preserve">สถานะ Emergency</w:t>
+      </w:r>
+      <w:r>
+        <w:rPr>
+          <w:sz w:val="32"/>
+          <w:szCs w:val="32"/>
+        </w:rPr>
+        <w:t xml:space="preserve">, </w:t>
+      </w:r>
+      <w:r>
+        <w:rPr>
+          <w:b/>
+          <w:bCs/>
+          <w:color w:val="1F2D3D"/>
+          <w:sz w:val="32"/>
+          <w:szCs w:val="32"/>
+        </w:rPr>
+        <w:t xml:space="preserve">สถานะ</w:t>
+      </w:r>
+      <w:r>
+        <w:rPr>
+          <w:sz w:val="32"/>
+          <w:szCs w:val="32"/>
+        </w:rPr>
+        <w:t xml:space="preserve">, </w:t>
+      </w:r>
+      <w:r>
+        <w:rPr>
+          <w:b/>
+          <w:bCs/>
+          <w:color w:val="1F2D3D"/>
+          <w:sz w:val="32"/>
+          <w:szCs w:val="32"/>
+        </w:rPr>
+        <w:t xml:space="preserve">อยู่สถานะนี้</w:t>
+      </w:r>
+      <w:r>
+        <w:rPr>
+          <w:sz w:val="32"/>
+          <w:szCs w:val="32"/>
+        </w:rPr>
+        <w:t xml:space="preserve"> (ค้างอยู่ในสถานะปัจจุบันมานานเท่าใด) และ </w:t>
+      </w:r>
+      <w:r>
+        <w:rPr>
+          <w:b/>
+          <w:bCs/>
+          <w:color w:val="1F2D3D"/>
+          <w:sz w:val="32"/>
+          <w:szCs w:val="32"/>
+        </w:rPr>
+        <w:t xml:space="preserve">อัปเดตล่าสุด</w:t>
+      </w:r>
+      <w:r>
+        <w:rPr>
+          <w:sz w:val="32"/>
+          <w:szCs w:val="32"/>
+        </w:rPr>
+        <w:t xml:space="preserve"> เมื่อคุณกดเงื่อนไขในข้อ 5.2 หรือแท่งกราฟในข้อ 5.5 ตารางจะขึ้นป้าย </w:t>
+      </w:r>
+      <w:r>
+        <w:rPr>
+          <w:b/>
+          <w:bCs/>
+          <w:color w:val="1F2D3D"/>
+          <w:sz w:val="32"/>
+          <w:szCs w:val="32"/>
+        </w:rPr>
+        <w:t xml:space="preserve">ตัวกรอง</w:t>
+      </w:r>
+      <w:r>
+        <w:rPr>
+          <w:sz w:val="32"/>
+          <w:szCs w:val="32"/>
+        </w:rPr>
+        <w:t xml:space="preserve"> บอกว่ากำลังกรองอะไรอยู่ กด </w:t>
+      </w:r>
+      <w:r>
+        <w:rPr>
+          <w:b/>
+          <w:bCs/>
+          <w:color w:val="1F2D3D"/>
+          <w:sz w:val="32"/>
+          <w:szCs w:val="32"/>
+        </w:rPr>
+        <w:t xml:space="preserve">ล้างตัวกรอง</w:t>
+      </w:r>
+      <w:r>
+        <w:rPr>
+          <w:sz w:val="32"/>
+          <w:szCs w:val="32"/>
+        </w:rPr>
+        <w:t xml:space="preserve"> เพื่อกลับไปดูทั้งหมด</w:t>
+      </w:r>
+    </w:p>
+    <w:p>
+      <w:pPr>
+        <w:spacing w:after="120"/>
+      </w:pPr>
+      <w:r>
+        <w:rPr>
+          <w:sz w:val="32"/>
+          <w:szCs w:val="32"/>
+        </w:rPr>
+        <w:t xml:space="preserve">ชื่อเรื่องเป็นคอลัมน์ถัดจากเลขที่ Ticket คอลัมน์สรุปเหตุการณ์แสดงข้อความจากช่อง สรุปเหตุการณ์ ในแบบฟอร์ม Ticket หาก Ticket เดิมไม่มีข้อมูลในช่องนั้น ระบบจะแสดงรายละเอียดเหตุการณ์แทน</w:t>
+      </w:r>
+    </w:p>
+    <w:tbl>
+      <w:tblPr>
+        <w:tblW w:type="dxa" w:w="9600"/>
+        <w:tblBorders>
+          <w:top w:val="dashed" w:color="9DB4D4" w:sz="6"/>
+          <w:left w:val="dashed" w:color="9DB4D4" w:sz="6"/>
+          <w:bottom w:val="dashed" w:color="9DB4D4" w:sz="6"/>
+          <w:right w:val="dashed" w:color="9DB4D4" w:sz="6"/>
+          <w:insideH w:val="single" w:color="auto" w:sz="4"/>
+          <w:insideV w:val="single" w:color="auto" w:sz="4"/>
+        </w:tblBorders>
+      </w:tblPr>
+      <w:tblGrid>
+        <w:gridCol w:w="9600"/>
+      </w:tblGrid>
+      <w:tr>
+        <w:tc>
+          <w:tcPr>
+            <w:tcW w:type="dxa" w:w="9600"/>
+            <w:shd w:fill="F7F8FA" w:color="auto" w:val="clear"/>
+            <w:tcMar>
+              <w:top w:type="dxa" w:w="520"/>
+              <w:left w:type="dxa" w:w="200"/>
+              <w:bottom w:type="dxa" w:w="520"/>
+              <w:right w:type="dxa" w:w="200"/>
+            </w:tcMar>
+            <w:vAlign w:val="center"/>
+          </w:tcPr>
+          <w:p>
+            <w:pPr>
+              <w:spacing w:after="40"/>
+              <w:jc w:val="center"/>
+            </w:pPr>
+            <w:r>
+              <w:rPr>
+                <w:b/>
+                <w:bCs/>
+                <w:color w:val="6C7888"/>
+                <w:sz w:val="30"/>
+                <w:szCs w:val="30"/>
+              </w:rPr>
+              <w:t xml:space="preserve">[ ตำแหน่งภาพหน้าจอ ]</w:t>
+            </w:r>
+          </w:p>
+          <w:p>
+            <w:pPr>
+              <w:spacing w:after="40"/>
+              <w:jc w:val="center"/>
+            </w:pPr>
+            <w:r>
+              <w:rPr>
+                <w:color w:val="1F2D3D"/>
+                <w:sz w:val="32"/>
+                <w:szCs w:val="32"/>
+              </w:rPr>
+              <w:t xml:space="preserve">ตารางรายละเอียด Ticket พร้อมป้ายตัวกรองและปุ่มล้างตัวกรอง</w:t>
+            </w:r>
+          </w:p>
+          <w:p>
+            <w:pPr>
+              <w:jc w:val="center"/>
+            </w:pPr>
+            <w:r>
+              <w:rPr>
+                <w:rFonts w:ascii="Consolas" w:cs="Consolas" w:eastAsia="Consolas" w:hAnsi="Consolas"/>
+                <w:color w:val="9AA6B4"/>
+                <w:sz w:val="24"/>
+                <w:szCs w:val="24"/>
+              </w:rPr>
+              <w:t xml:space="preserve">SHOT: EXE-ticket-table</w:t>
+            </w:r>
+          </w:p>
+        </w:tc>
+      </w:tr>
+    </w:tbl>
+    <w:p>
+      <w:pPr>
+        <w:spacing w:after="160" w:before="60"/>
+        <w:jc w:val="center"/>
+      </w:pPr>
+      <w:r>
+        <w:rPr>
+          <w:b/>
+          <w:bCs/>
+          <w:color w:val="245EA8"/>
+          <w:sz w:val="28"/>
+          <w:szCs w:val="28"/>
+        </w:rPr>
+        <w:t xml:space="preserve">รูปที่ 5-6  </w:t>
       </w:r>
       <w:r>
         <w:rPr>
@@ -2834,7 +4444,7 @@
                 <w:sz w:val="32"/>
                 <w:szCs w:val="32"/>
               </w:rPr>
-              <w:t xml:space="preserve">ตารางนี้อ่านอย่างเดียว คุณเปิดหน้ารายละเอียดของแต่ละเคสไม่ได้ หากต้องการเจาะลึกเคสใดเป็นการเฉพาะ ให้ประสานกับผู้จัดการ SOC</w:t>
+              <w:t xml:space="preserve">ตารางนี้อ่านอย่างเดียว เลขที่เคสแสดงเป็นลิงก์ แต่บทบาทของคุณเปิดหน้ารายละเอียดเคสไม่ได้ — กดแล้วจะขึ้นหน้าไม่พบข้อมูล หากต้องการเจาะลึกเคสใดเป็นการเฉพาะ ให้ประสานกับผู้จัดการ SOC</w:t>
             </w:r>
           </w:p>
         </w:tc>
@@ -3049,7 +4659,7 @@
           <w:sz w:val="32"/>
           <w:szCs w:val="32"/>
         </w:rPr>
-        <w:t xml:space="preserve">บทบาทผู้บริหารออกแบบให้เห็นเฉพาะแดชบอร์ดสรุป เพื่อให้โฟกัสที่ภาพรวม ไม่ใช่รายเคส หากต้องการรายละเอียดเคสใดเป็นการเฉพาะ ให้ประสานกับผู้จัดการ SOC</w:t>
+        <w:t xml:space="preserve">บทบาทผู้บริหารออกแบบให้เห็นเฉพาะแดชบอร์ด เพื่อให้โฟกัสที่ภาพรวม ไม่ใช่รายเคส หากต้องการรายละเอียดเคสใดเป็นการเฉพาะ ให้ประสานกับผู้จัดการ SOC</w:t>
       </w:r>
     </w:p>
     <w:p>
@@ -3057,6 +4667,26 @@
         <w:pStyle w:val="Heading3"/>
       </w:pPr>
       <w:r>
+        <w:t xml:space="preserve">ทำไมเข้าสู่ระบบแล้วไม่เจอแดชบอร์ดผู้บริหารทันที?</w:t>
+      </w:r>
+    </w:p>
+    <w:p>
+      <w:pPr>
+        <w:spacing w:after="120"/>
+      </w:pPr>
+      <w:r>
+        <w:rPr>
+          <w:sz w:val="32"/>
+          <w:szCs w:val="32"/>
+        </w:rPr>
+        <w:t xml:space="preserve">หน้าแรกหลังเข้าสู่ระบบคือแดชบอร์ด SOC กดเมนู “ภาพรวม › แดชบอร์ดผู้บริหาร” เพื่อเปิดหน้าสรุปของคุณ (ดูหัวข้อ 3 และ 4)</w:t>
+      </w:r>
+    </w:p>
+    <w:p>
+      <w:pPr>
+        <w:pStyle w:val="Heading3"/>
+      </w:pPr>
+      <w:r>
         <w:t xml:space="preserve">ตัวเลขอัปเดตบ่อยแค่ไหน?</w:t>
       </w:r>
     </w:p>
@@ -3069,7 +4699,7 @@
           <w:sz w:val="32"/>
           <w:szCs w:val="32"/>
         </w:rPr>
-        <w:t xml:space="preserve">แดชบอร์ดสรุปจากข้อมูลล่าสุดในระบบ เวลาที่ดึงข้อมูลแสดงไว้ที่หัวหน้าจอ (“ข้อมูล ณ เวลา”) และช่วงเวลาที่ใช้คำนวณบางตัวชี้วัด เช่น MTTR จะระบุไว้ใต้การ์ดนั้น ๆ</w:t>
+        <w:t xml:space="preserve">แดชบอร์ดสรุปจากข้อมูลล่าสุดในระบบ เวลาที่ดึงข้อมูลแสดงไว้ที่หัวหน้าจอ (“หน้าแดชบอร์ดอัปเดต”) หน้านี้โหลดตัวเลขใหม่เองทุก 5 นาทีขณะเปิดค้างไว้ (เว้นช่วงที่คุณกำลังคลิกหรือพิมพ์อยู่) และช่วงเวลาที่ใช้คำนวณบางตัวชี้วัด เช่น MTTR จะระบุไว้ใต้การ์ดนั้น ๆ</w:t>
       </w:r>
     </w:p>
     <w:p>
@@ -3089,7 +4719,7 @@
           <w:sz w:val="32"/>
           <w:szCs w:val="32"/>
         </w:rPr>
-        <w:t xml:space="preserve">ตรวจช่วงเวลาที่เลือกในแถบตัวกรองเป็นอันดับแรก (ดู 5.1) ตัวเลขเกือบทั้งหมดบนหน้านี้เปลี่ยนตามช่วงเวลาที่เลือก ขณะที่ MTTR คิดจากเคสที่ปิดใน 30 วันล่าสุดเสมอ ไม่ได้คิดตามช่วงที่เลือก</w:t>
+        <w:t xml:space="preserve">ตรวจช่วงเวลาที่เลือกในแถบตัวกรองเป็นอันดับแรก (ดู 5.1) ความคืบหน้าการปิดเคส กราฟ และตารางเปลี่ยนตามช่วงเวลาที่เลือก แต่สรุปสถานการณ์และการ์ดเคสทั้งหมดดูทุกช่วงเวลาเสมอ และ MTTR คิดจากเคสที่ปิดใน 30 วันล่าสุดเสมอ</w:t>
       </w:r>
     </w:p>
     <w:p>
@@ -3109,7 +4739,7 @@
           <w:sz w:val="32"/>
           <w:szCs w:val="32"/>
         </w:rPr>
-        <w:t xml:space="preserve">ที่กล่องสรุปสถานการณ์ กดบรรทัดเงื่อนไขที่สนใจ เช่น “เคสที่รอผู้ดูแลระบบ / เจ้าของระบบ” ตารางด้านล่างจะกรองให้เหลือเฉพาะเคสกลุ่มนั้นพร้อมชื่อผู้รับผิดชอบ (ดู 5.2 และ 5.6)</w:t>
+        <w:t xml:space="preserve">ที่กล่องสรุปสถานการณ์ กดบรรทัดเงื่อนไขที่สนใจ เช่น “เคสที่รอผู้ดูแลระบบ / เจ้าของระบบ” ตารางด้านล่างจะกรองให้เหลือเฉพาะเคสกลุ่มนั้นพร้อมชื่อผู้รับผิดชอบ (ดู 5.2 และ 5.7)</w:t>
       </w:r>
     </w:p>
     <w:p>

</xml_diff>

<commit_message>
30/9 Dasboards Improvement 2
</commit_message>
<xml_diff>
--- a/docs/user-guides/manuals/user-manual-executive.th.docx
+++ b/docs/user-guides/manuals/user-manual-executive.th.docx
@@ -3374,7 +3374,7 @@
           <w:sz w:val="32"/>
           <w:szCs w:val="32"/>
         </w:rPr>
-        <w:t xml:space="preserve"> ตามด้วยแถบ รับเข้า (คำขอที่สร้างในช่วงเวลา) และ ส่งงาน (คำขอที่เสร็จสิ้นในช่วงเวลา) หน่วยเป็นคำขอ รวมทุกฟังก์ชัน กดการ์ดเพื่อดูรายการคำขอที่รับเข้า</w:t>
+        <w:t xml:space="preserve"> ใต้ประโยคเป็นกราฟเส้นสะสมสองเส้น: เส้นทึบสีน้ำเงินคือ รับเข้า (คำขอที่สร้างในช่วงเวลา) เส้นประสีเทาคือ ส่งงาน (คำขอที่เสร็จสิ้นในช่วงเวลา) ทั้งสองเส้นเริ่มนับจากต้นช่วงเวลา พื้นที่แรเงาระหว่างสองเส้นคือส่วนที่รับเข้ามากกว่าส่งงาน — ถ้าช่องว่างกว้างขึ้นเรื่อย ๆ แปลว่างานสะสมเพิ่มขึ้น ชี้ที่กราฟเพื่อดูยอดสะสม ส่วนต่าง และจำนวนเฉพาะวันนั้น ช่วงไม่เกินประมาณ 2 เดือนแสดงรายวัน ช่วงที่ยาวกว่านั้น (เช่น “ทั้งหมด”) แสดงรายสัปดาห์ ส่วนช่วง “วันนี้” สั้นเกินกว่าจะเห็นแนวโน้ม จึงแสดงเป็นแถบยอดรวมแทน หน่วยเป็นคำขอ รวมทุกฟังก์ชัน กดลูกศร › มุมขวาบนของการ์ดเพื่อดูรายการคำขอที่รับเข้า (ปรับปรุง 30 ก.ย. 2026)</w:t>
       </w:r>
     </w:p>
     <w:p>
@@ -3452,7 +3452,7 @@
                 <w:sz w:val="32"/>
                 <w:szCs w:val="32"/>
               </w:rPr>
-              <w:t xml:space="preserve">แถวงานค้าง: ฟังก์ชันที่ทำให้งานค้าง งานเข้าเทียบงานเสร็จ และ High/Critical ที่ยังไม่ปิด</w:t>
+              <w:t xml:space="preserve">แถวงานค้าง: ฟังก์ชันที่ทำให้งานค้าง งานเข้าเทียบงานเสร็จ (กราฟเส้นสะสม) และ High/Critical ที่ยังไม่ปิด</w:t>
             </w:r>
           </w:p>
           <w:p>
@@ -3495,7 +3495,7 @@
           <w:sz w:val="28"/>
           <w:szCs w:val="28"/>
         </w:rPr>
-        <w:t xml:space="preserve">แถวงานค้าง: ฟังก์ชันที่ทำให้งานค้าง งานเข้าเทียบงานเสร็จ และ High/Critical ที่ยังไม่ปิด</w:t>
+        <w:t xml:space="preserve">แถวงานค้าง: ฟังก์ชันที่ทำให้งานค้าง งานเข้าเทียบงานเสร็จ (กราฟเส้นสะสม) และ High/Critical ที่ยังไม่ปิด</w:t>
       </w:r>
     </w:p>
     <w:tbl>

</xml_diff>